<commit_message>
docs(tdd): update as-built TDD for platform-identity
</commit_message>
<xml_diff>
--- a/agent-output/marekgroup/tdd/TDD_platform-identity_20260428.docx
+++ b/agent-output/marekgroup/tdd/TDD_platform-identity_20260428.docx
@@ -240,7 +240,7 @@
               <w:rPr>
                 <w:sz w:val="18"/>
               </w:rPr>
-              <w:t>alz-platform-identity-20260428152453</w:t>
+              <w:t>alz-platform-identity-20260428182954</w:t>
             </w:r>
           </w:p>
         </w:tc>
@@ -270,7 +270,7 @@
               <w:rPr>
                 <w:sz w:val="18"/>
               </w:rPr>
-              <w:t>2026-04-28 15:27 UTC</w:t>
+              <w:t>2026-04-28 18:31 UTC</w:t>
             </w:r>
           </w:p>
         </w:tc>
@@ -617,7 +617,7 @@
               <w:rPr>
                 <w:sz w:val="18"/>
               </w:rPr>
-              <w:t>alz-platform-identity-20260428152453</w:t>
+              <w:t>alz-platform-identity-20260428182954</w:t>
             </w:r>
           </w:p>
         </w:tc>
@@ -643,7 +643,7 @@
       <w:r>
         <w:drawing>
           <wp:inline xmlns:a="http://schemas.openxmlformats.org/drawingml/2006/main" xmlns:pic="http://schemas.openxmlformats.org/drawingml/2006/picture">
-            <wp:extent cx="5943600" cy="4669971"/>
+            <wp:extent cx="5943600" cy="7692717"/>
             <wp:docPr id="1" name="Picture 1"/>
             <wp:cNvGraphicFramePr>
               <a:graphicFrameLocks noChangeAspect="1"/>
@@ -664,7 +664,7 @@
                   <pic:spPr>
                     <a:xfrm>
                       <a:off x="0" y="0"/>
-                      <a:ext cx="5943600" cy="4669971"/>
+                      <a:ext cx="5943600" cy="7692717"/>
                     </a:xfrm>
                     <a:prstGeom prst="rect"/>
                   </pic:spPr>
@@ -799,7 +799,7 @@
               <w:rPr>
                 <w:sz w:val="18"/>
               </w:rPr>
-              <w:t>networkwatchers</w:t>
+              <w:t>virtualnetworks</w:t>
             </w:r>
           </w:p>
         </w:tc>
@@ -828,7 +828,7 @@
               <w:rPr>
                 <w:sz w:val="18"/>
               </w:rPr>
-              <w:t>virtualnetworks</w:t>
+              <w:t>networkwatchers</w:t>
             </w:r>
           </w:p>
         </w:tc>
@@ -857,7 +857,7 @@
               <w:rPr>
                 <w:sz w:val="18"/>
               </w:rPr>
-              <w:t>userassignedidentities</w:t>
+              <w:t>networkinterfaces</w:t>
             </w:r>
           </w:p>
         </w:tc>
@@ -886,7 +886,7 @@
               <w:rPr>
                 <w:sz w:val="18"/>
               </w:rPr>
-              <w:t>networkinterfaces</w:t>
+              <w:t>userassignedidentities</w:t>
             </w:r>
           </w:p>
         </w:tc>
@@ -900,6 +900,64 @@
                 <w:sz w:val="18"/>
               </w:rPr>
               <w:t>2</w:t>
+            </w:r>
+          </w:p>
+        </w:tc>
+      </w:tr>
+      <w:tr>
+        <w:tc>
+          <w:tcPr>
+            <w:tcW w:type="dxa" w:w="5669"/>
+            <w:shd w:val="clear" w:color="auto" w:fill="F2F2F2"/>
+          </w:tcPr>
+          <w:p>
+            <w:r>
+              <w:rPr>
+                <w:sz w:val="18"/>
+              </w:rPr>
+              <w:t>virtualmachines</w:t>
+            </w:r>
+          </w:p>
+        </w:tc>
+        <w:tc>
+          <w:tcPr>
+            <w:tcW w:type="dxa" w:w="2268"/>
+            <w:shd w:val="clear" w:color="auto" w:fill="F2F2F2"/>
+          </w:tcPr>
+          <w:p>
+            <w:r>
+              <w:rPr>
+                <w:sz w:val="18"/>
+              </w:rPr>
+              <w:t>1</w:t>
+            </w:r>
+          </w:p>
+        </w:tc>
+      </w:tr>
+      <w:tr>
+        <w:tc>
+          <w:tcPr>
+            <w:tcW w:type="dxa" w:w="5669"/>
+          </w:tcPr>
+          <w:p>
+            <w:r>
+              <w:rPr>
+                <w:sz w:val="18"/>
+              </w:rPr>
+              <w:t>publicipaddresses</w:t>
+            </w:r>
+          </w:p>
+        </w:tc>
+        <w:tc>
+          <w:tcPr>
+            <w:tcW w:type="dxa" w:w="2268"/>
+          </w:tcPr>
+          <w:p>
+            <w:r>
+              <w:rPr>
+                <w:sz w:val="18"/>
+              </w:rPr>
+              <w:t>1</w:t>
             </w:r>
           </w:p>
         </w:tc>
@@ -945,6 +1003,122 @@
                 <w:sz w:val="18"/>
               </w:rPr>
               <w:t>virtualnetworklinks</w:t>
+            </w:r>
+          </w:p>
+        </w:tc>
+        <w:tc>
+          <w:tcPr>
+            <w:tcW w:type="dxa" w:w="2268"/>
+          </w:tcPr>
+          <w:p>
+            <w:r>
+              <w:rPr>
+                <w:sz w:val="18"/>
+              </w:rPr>
+              <w:t>1</w:t>
+            </w:r>
+          </w:p>
+        </w:tc>
+      </w:tr>
+      <w:tr>
+        <w:tc>
+          <w:tcPr>
+            <w:tcW w:type="dxa" w:w="5669"/>
+            <w:shd w:val="clear" w:color="auto" w:fill="F2F2F2"/>
+          </w:tcPr>
+          <w:p>
+            <w:r>
+              <w:rPr>
+                <w:sz w:val="18"/>
+              </w:rPr>
+              <w:t>systemtopics</w:t>
+            </w:r>
+          </w:p>
+        </w:tc>
+        <w:tc>
+          <w:tcPr>
+            <w:tcW w:type="dxa" w:w="2268"/>
+            <w:shd w:val="clear" w:color="auto" w:fill="F2F2F2"/>
+          </w:tcPr>
+          <w:p>
+            <w:r>
+              <w:rPr>
+                <w:sz w:val="18"/>
+              </w:rPr>
+              <w:t>1</w:t>
+            </w:r>
+          </w:p>
+        </w:tc>
+      </w:tr>
+      <w:tr>
+        <w:tc>
+          <w:tcPr>
+            <w:tcW w:type="dxa" w:w="5669"/>
+          </w:tcPr>
+          <w:p>
+            <w:r>
+              <w:rPr>
+                <w:sz w:val="18"/>
+              </w:rPr>
+              <w:t>extensions</w:t>
+            </w:r>
+          </w:p>
+        </w:tc>
+        <w:tc>
+          <w:tcPr>
+            <w:tcW w:type="dxa" w:w="2268"/>
+          </w:tcPr>
+          <w:p>
+            <w:r>
+              <w:rPr>
+                <w:sz w:val="18"/>
+              </w:rPr>
+              <w:t>1</w:t>
+            </w:r>
+          </w:p>
+        </w:tc>
+      </w:tr>
+      <w:tr>
+        <w:tc>
+          <w:tcPr>
+            <w:tcW w:type="dxa" w:w="5669"/>
+            <w:shd w:val="clear" w:color="auto" w:fill="F2F2F2"/>
+          </w:tcPr>
+          <w:p>
+            <w:r>
+              <w:rPr>
+                <w:sz w:val="18"/>
+              </w:rPr>
+              <w:t>bastionhosts</w:t>
+            </w:r>
+          </w:p>
+        </w:tc>
+        <w:tc>
+          <w:tcPr>
+            <w:tcW w:type="dxa" w:w="2268"/>
+            <w:shd w:val="clear" w:color="auto" w:fill="F2F2F2"/>
+          </w:tcPr>
+          <w:p>
+            <w:r>
+              <w:rPr>
+                <w:sz w:val="18"/>
+              </w:rPr>
+              <w:t>1</w:t>
+            </w:r>
+          </w:p>
+        </w:tc>
+      </w:tr>
+      <w:tr>
+        <w:tc>
+          <w:tcPr>
+            <w:tcW w:type="dxa" w:w="5669"/>
+          </w:tcPr>
+          <w:p>
+            <w:r>
+              <w:rPr>
+                <w:sz w:val="18"/>
+              </w:rPr>
+              <w:t>storageaccounts</w:t>
             </w:r>
           </w:p>
         </w:tc>
@@ -1031,181 +1205,7 @@
               <w:rPr>
                 <w:sz w:val="18"/>
               </w:rPr>
-              <w:t>bastionhosts</w:t>
-            </w:r>
-          </w:p>
-        </w:tc>
-        <w:tc>
-          <w:tcPr>
-            <w:tcW w:type="dxa" w:w="2268"/>
-            <w:shd w:val="clear" w:color="auto" w:fill="F2F2F2"/>
-          </w:tcPr>
-          <w:p>
-            <w:r>
-              <w:rPr>
-                <w:sz w:val="18"/>
-              </w:rPr>
-              <w:t>1</w:t>
-            </w:r>
-          </w:p>
-        </w:tc>
-      </w:tr>
-      <w:tr>
-        <w:tc>
-          <w:tcPr>
-            <w:tcW w:type="dxa" w:w="5669"/>
-          </w:tcPr>
-          <w:p>
-            <w:r>
-              <w:rPr>
-                <w:sz w:val="18"/>
-              </w:rPr>
               <w:t>movecollections</w:t>
-            </w:r>
-          </w:p>
-        </w:tc>
-        <w:tc>
-          <w:tcPr>
-            <w:tcW w:type="dxa" w:w="2268"/>
-          </w:tcPr>
-          <w:p>
-            <w:r>
-              <w:rPr>
-                <w:sz w:val="18"/>
-              </w:rPr>
-              <w:t>1</w:t>
-            </w:r>
-          </w:p>
-        </w:tc>
-      </w:tr>
-      <w:tr>
-        <w:tc>
-          <w:tcPr>
-            <w:tcW w:type="dxa" w:w="5669"/>
-            <w:shd w:val="clear" w:color="auto" w:fill="F2F2F2"/>
-          </w:tcPr>
-          <w:p>
-            <w:r>
-              <w:rPr>
-                <w:sz w:val="18"/>
-              </w:rPr>
-              <w:t>systemtopics</w:t>
-            </w:r>
-          </w:p>
-        </w:tc>
-        <w:tc>
-          <w:tcPr>
-            <w:tcW w:type="dxa" w:w="2268"/>
-            <w:shd w:val="clear" w:color="auto" w:fill="F2F2F2"/>
-          </w:tcPr>
-          <w:p>
-            <w:r>
-              <w:rPr>
-                <w:sz w:val="18"/>
-              </w:rPr>
-              <w:t>1</w:t>
-            </w:r>
-          </w:p>
-        </w:tc>
-      </w:tr>
-      <w:tr>
-        <w:tc>
-          <w:tcPr>
-            <w:tcW w:type="dxa" w:w="5669"/>
-          </w:tcPr>
-          <w:p>
-            <w:r>
-              <w:rPr>
-                <w:sz w:val="18"/>
-              </w:rPr>
-              <w:t>virtualmachines</w:t>
-            </w:r>
-          </w:p>
-        </w:tc>
-        <w:tc>
-          <w:tcPr>
-            <w:tcW w:type="dxa" w:w="2268"/>
-          </w:tcPr>
-          <w:p>
-            <w:r>
-              <w:rPr>
-                <w:sz w:val="18"/>
-              </w:rPr>
-              <w:t>1</w:t>
-            </w:r>
-          </w:p>
-        </w:tc>
-      </w:tr>
-      <w:tr>
-        <w:tc>
-          <w:tcPr>
-            <w:tcW w:type="dxa" w:w="5669"/>
-            <w:shd w:val="clear" w:color="auto" w:fill="F2F2F2"/>
-          </w:tcPr>
-          <w:p>
-            <w:r>
-              <w:rPr>
-                <w:sz w:val="18"/>
-              </w:rPr>
-              <w:t>storageaccounts</w:t>
-            </w:r>
-          </w:p>
-        </w:tc>
-        <w:tc>
-          <w:tcPr>
-            <w:tcW w:type="dxa" w:w="2268"/>
-            <w:shd w:val="clear" w:color="auto" w:fill="F2F2F2"/>
-          </w:tcPr>
-          <w:p>
-            <w:r>
-              <w:rPr>
-                <w:sz w:val="18"/>
-              </w:rPr>
-              <w:t>1</w:t>
-            </w:r>
-          </w:p>
-        </w:tc>
-      </w:tr>
-      <w:tr>
-        <w:tc>
-          <w:tcPr>
-            <w:tcW w:type="dxa" w:w="5669"/>
-          </w:tcPr>
-          <w:p>
-            <w:r>
-              <w:rPr>
-                <w:sz w:val="18"/>
-              </w:rPr>
-              <w:t>extensions</w:t>
-            </w:r>
-          </w:p>
-        </w:tc>
-        <w:tc>
-          <w:tcPr>
-            <w:tcW w:type="dxa" w:w="2268"/>
-          </w:tcPr>
-          <w:p>
-            <w:r>
-              <w:rPr>
-                <w:sz w:val="18"/>
-              </w:rPr>
-              <w:t>1</w:t>
-            </w:r>
-          </w:p>
-        </w:tc>
-      </w:tr>
-      <w:tr>
-        <w:tc>
-          <w:tcPr>
-            <w:tcW w:type="dxa" w:w="5669"/>
-            <w:shd w:val="clear" w:color="auto" w:fill="F2F2F2"/>
-          </w:tcPr>
-          <w:p>
-            <w:r>
-              <w:rPr>
-                <w:sz w:val="18"/>
-              </w:rPr>
-              <w:t>publicipaddresses</w:t>
             </w:r>
           </w:p>
         </w:tc>
@@ -3601,8 +3601,55 @@
       </w:r>
     </w:p>
     <w:p>
+      <w:pPr>
+        <w:jc w:val="center"/>
+      </w:pPr>
       <w:r>
-        <w:t>[Estate diagram unavailable: failed to execute PosixPath('dot'), make sure the Graphviz executables are on your systems' PATH]</w:t>
+        <w:drawing>
+          <wp:inline xmlns:a="http://schemas.openxmlformats.org/drawingml/2006/main" xmlns:pic="http://schemas.openxmlformats.org/drawingml/2006/picture">
+            <wp:extent cx="5943600" cy="2240441"/>
+            <wp:docPr id="2" name="Picture 2"/>
+            <wp:cNvGraphicFramePr>
+              <a:graphicFrameLocks noChangeAspect="1"/>
+            </wp:cNvGraphicFramePr>
+            <a:graphic>
+              <a:graphicData uri="http://schemas.openxmlformats.org/drawingml/2006/picture">
+                <pic:pic>
+                  <pic:nvPicPr>
+                    <pic:cNvPr id="0" name="alz-estate-overview.png"/>
+                    <pic:cNvPicPr/>
+                  </pic:nvPicPr>
+                  <pic:blipFill>
+                    <a:blip r:embed="rId10"/>
+                    <a:stretch>
+                      <a:fillRect/>
+                    </a:stretch>
+                  </pic:blipFill>
+                  <pic:spPr>
+                    <a:xfrm>
+                      <a:off x="0" y="0"/>
+                      <a:ext cx="5943600" cy="2240441"/>
+                    </a:xfrm>
+                    <a:prstGeom prst="rect"/>
+                  </pic:spPr>
+                </pic:pic>
+              </a:graphicData>
+            </a:graphic>
+          </wp:inline>
+        </w:drawing>
+      </w:r>
+    </w:p>
+    <w:p>
+      <w:pPr>
+        <w:jc w:val="center"/>
+      </w:pPr>
+      <w:r>
+        <w:rPr>
+          <w:i/>
+          <w:color w:val="6B6B6B"/>
+          <w:sz w:val="18"/>
+        </w:rPr>
+        <w:t>Figure 2: Full Azure Landing Zone Estate</w:t>
       </w:r>
     </w:p>
     <w:p>

</xml_diff>

<commit_message>
docs(tdd): update as-built TDD for platform-identity (#27)
Auto-generated TDD from deployment run
[25070604804](https://github.com/MaRekGroup/agentic-alz-accelerator/actions/runs/25070604804).

Co-authored-by: github-actions[bot] <41898282+github-actions[bot]@users.noreply.github.com>
</commit_message>
<xml_diff>
--- a/agent-output/marekgroup/tdd/TDD_platform-identity_20260428.docx
+++ b/agent-output/marekgroup/tdd/TDD_platform-identity_20260428.docx
@@ -240,7 +240,7 @@
               <w:rPr>
                 <w:sz w:val="18"/>
               </w:rPr>
-              <w:t>alz-platform-identity-20260428152453</w:t>
+              <w:t>alz-platform-identity-20260428182954</w:t>
             </w:r>
           </w:p>
         </w:tc>
@@ -270,7 +270,7 @@
               <w:rPr>
                 <w:sz w:val="18"/>
               </w:rPr>
-              <w:t>2026-04-28 15:27 UTC</w:t>
+              <w:t>2026-04-28 18:31 UTC</w:t>
             </w:r>
           </w:p>
         </w:tc>
@@ -617,7 +617,7 @@
               <w:rPr>
                 <w:sz w:val="18"/>
               </w:rPr>
-              <w:t>alz-platform-identity-20260428152453</w:t>
+              <w:t>alz-platform-identity-20260428182954</w:t>
             </w:r>
           </w:p>
         </w:tc>
@@ -643,7 +643,7 @@
       <w:r>
         <w:drawing>
           <wp:inline xmlns:a="http://schemas.openxmlformats.org/drawingml/2006/main" xmlns:pic="http://schemas.openxmlformats.org/drawingml/2006/picture">
-            <wp:extent cx="5943600" cy="4669971"/>
+            <wp:extent cx="5943600" cy="7692717"/>
             <wp:docPr id="1" name="Picture 1"/>
             <wp:cNvGraphicFramePr>
               <a:graphicFrameLocks noChangeAspect="1"/>
@@ -664,7 +664,7 @@
                   <pic:spPr>
                     <a:xfrm>
                       <a:off x="0" y="0"/>
-                      <a:ext cx="5943600" cy="4669971"/>
+                      <a:ext cx="5943600" cy="7692717"/>
                     </a:xfrm>
                     <a:prstGeom prst="rect"/>
                   </pic:spPr>
@@ -799,7 +799,7 @@
               <w:rPr>
                 <w:sz w:val="18"/>
               </w:rPr>
-              <w:t>networkwatchers</w:t>
+              <w:t>virtualnetworks</w:t>
             </w:r>
           </w:p>
         </w:tc>
@@ -828,7 +828,7 @@
               <w:rPr>
                 <w:sz w:val="18"/>
               </w:rPr>
-              <w:t>virtualnetworks</w:t>
+              <w:t>networkwatchers</w:t>
             </w:r>
           </w:p>
         </w:tc>
@@ -857,7 +857,7 @@
               <w:rPr>
                 <w:sz w:val="18"/>
               </w:rPr>
-              <w:t>userassignedidentities</w:t>
+              <w:t>networkinterfaces</w:t>
             </w:r>
           </w:p>
         </w:tc>
@@ -886,7 +886,7 @@
               <w:rPr>
                 <w:sz w:val="18"/>
               </w:rPr>
-              <w:t>networkinterfaces</w:t>
+              <w:t>userassignedidentities</w:t>
             </w:r>
           </w:p>
         </w:tc>
@@ -900,6 +900,64 @@
                 <w:sz w:val="18"/>
               </w:rPr>
               <w:t>2</w:t>
+            </w:r>
+          </w:p>
+        </w:tc>
+      </w:tr>
+      <w:tr>
+        <w:tc>
+          <w:tcPr>
+            <w:tcW w:type="dxa" w:w="5669"/>
+            <w:shd w:val="clear" w:color="auto" w:fill="F2F2F2"/>
+          </w:tcPr>
+          <w:p>
+            <w:r>
+              <w:rPr>
+                <w:sz w:val="18"/>
+              </w:rPr>
+              <w:t>virtualmachines</w:t>
+            </w:r>
+          </w:p>
+        </w:tc>
+        <w:tc>
+          <w:tcPr>
+            <w:tcW w:type="dxa" w:w="2268"/>
+            <w:shd w:val="clear" w:color="auto" w:fill="F2F2F2"/>
+          </w:tcPr>
+          <w:p>
+            <w:r>
+              <w:rPr>
+                <w:sz w:val="18"/>
+              </w:rPr>
+              <w:t>1</w:t>
+            </w:r>
+          </w:p>
+        </w:tc>
+      </w:tr>
+      <w:tr>
+        <w:tc>
+          <w:tcPr>
+            <w:tcW w:type="dxa" w:w="5669"/>
+          </w:tcPr>
+          <w:p>
+            <w:r>
+              <w:rPr>
+                <w:sz w:val="18"/>
+              </w:rPr>
+              <w:t>publicipaddresses</w:t>
+            </w:r>
+          </w:p>
+        </w:tc>
+        <w:tc>
+          <w:tcPr>
+            <w:tcW w:type="dxa" w:w="2268"/>
+          </w:tcPr>
+          <w:p>
+            <w:r>
+              <w:rPr>
+                <w:sz w:val="18"/>
+              </w:rPr>
+              <w:t>1</w:t>
             </w:r>
           </w:p>
         </w:tc>
@@ -945,6 +1003,122 @@
                 <w:sz w:val="18"/>
               </w:rPr>
               <w:t>virtualnetworklinks</w:t>
+            </w:r>
+          </w:p>
+        </w:tc>
+        <w:tc>
+          <w:tcPr>
+            <w:tcW w:type="dxa" w:w="2268"/>
+          </w:tcPr>
+          <w:p>
+            <w:r>
+              <w:rPr>
+                <w:sz w:val="18"/>
+              </w:rPr>
+              <w:t>1</w:t>
+            </w:r>
+          </w:p>
+        </w:tc>
+      </w:tr>
+      <w:tr>
+        <w:tc>
+          <w:tcPr>
+            <w:tcW w:type="dxa" w:w="5669"/>
+            <w:shd w:val="clear" w:color="auto" w:fill="F2F2F2"/>
+          </w:tcPr>
+          <w:p>
+            <w:r>
+              <w:rPr>
+                <w:sz w:val="18"/>
+              </w:rPr>
+              <w:t>systemtopics</w:t>
+            </w:r>
+          </w:p>
+        </w:tc>
+        <w:tc>
+          <w:tcPr>
+            <w:tcW w:type="dxa" w:w="2268"/>
+            <w:shd w:val="clear" w:color="auto" w:fill="F2F2F2"/>
+          </w:tcPr>
+          <w:p>
+            <w:r>
+              <w:rPr>
+                <w:sz w:val="18"/>
+              </w:rPr>
+              <w:t>1</w:t>
+            </w:r>
+          </w:p>
+        </w:tc>
+      </w:tr>
+      <w:tr>
+        <w:tc>
+          <w:tcPr>
+            <w:tcW w:type="dxa" w:w="5669"/>
+          </w:tcPr>
+          <w:p>
+            <w:r>
+              <w:rPr>
+                <w:sz w:val="18"/>
+              </w:rPr>
+              <w:t>extensions</w:t>
+            </w:r>
+          </w:p>
+        </w:tc>
+        <w:tc>
+          <w:tcPr>
+            <w:tcW w:type="dxa" w:w="2268"/>
+          </w:tcPr>
+          <w:p>
+            <w:r>
+              <w:rPr>
+                <w:sz w:val="18"/>
+              </w:rPr>
+              <w:t>1</w:t>
+            </w:r>
+          </w:p>
+        </w:tc>
+      </w:tr>
+      <w:tr>
+        <w:tc>
+          <w:tcPr>
+            <w:tcW w:type="dxa" w:w="5669"/>
+            <w:shd w:val="clear" w:color="auto" w:fill="F2F2F2"/>
+          </w:tcPr>
+          <w:p>
+            <w:r>
+              <w:rPr>
+                <w:sz w:val="18"/>
+              </w:rPr>
+              <w:t>bastionhosts</w:t>
+            </w:r>
+          </w:p>
+        </w:tc>
+        <w:tc>
+          <w:tcPr>
+            <w:tcW w:type="dxa" w:w="2268"/>
+            <w:shd w:val="clear" w:color="auto" w:fill="F2F2F2"/>
+          </w:tcPr>
+          <w:p>
+            <w:r>
+              <w:rPr>
+                <w:sz w:val="18"/>
+              </w:rPr>
+              <w:t>1</w:t>
+            </w:r>
+          </w:p>
+        </w:tc>
+      </w:tr>
+      <w:tr>
+        <w:tc>
+          <w:tcPr>
+            <w:tcW w:type="dxa" w:w="5669"/>
+          </w:tcPr>
+          <w:p>
+            <w:r>
+              <w:rPr>
+                <w:sz w:val="18"/>
+              </w:rPr>
+              <w:t>storageaccounts</w:t>
             </w:r>
           </w:p>
         </w:tc>
@@ -1031,181 +1205,7 @@
               <w:rPr>
                 <w:sz w:val="18"/>
               </w:rPr>
-              <w:t>bastionhosts</w:t>
-            </w:r>
-          </w:p>
-        </w:tc>
-        <w:tc>
-          <w:tcPr>
-            <w:tcW w:type="dxa" w:w="2268"/>
-            <w:shd w:val="clear" w:color="auto" w:fill="F2F2F2"/>
-          </w:tcPr>
-          <w:p>
-            <w:r>
-              <w:rPr>
-                <w:sz w:val="18"/>
-              </w:rPr>
-              <w:t>1</w:t>
-            </w:r>
-          </w:p>
-        </w:tc>
-      </w:tr>
-      <w:tr>
-        <w:tc>
-          <w:tcPr>
-            <w:tcW w:type="dxa" w:w="5669"/>
-          </w:tcPr>
-          <w:p>
-            <w:r>
-              <w:rPr>
-                <w:sz w:val="18"/>
-              </w:rPr>
               <w:t>movecollections</w:t>
-            </w:r>
-          </w:p>
-        </w:tc>
-        <w:tc>
-          <w:tcPr>
-            <w:tcW w:type="dxa" w:w="2268"/>
-          </w:tcPr>
-          <w:p>
-            <w:r>
-              <w:rPr>
-                <w:sz w:val="18"/>
-              </w:rPr>
-              <w:t>1</w:t>
-            </w:r>
-          </w:p>
-        </w:tc>
-      </w:tr>
-      <w:tr>
-        <w:tc>
-          <w:tcPr>
-            <w:tcW w:type="dxa" w:w="5669"/>
-            <w:shd w:val="clear" w:color="auto" w:fill="F2F2F2"/>
-          </w:tcPr>
-          <w:p>
-            <w:r>
-              <w:rPr>
-                <w:sz w:val="18"/>
-              </w:rPr>
-              <w:t>systemtopics</w:t>
-            </w:r>
-          </w:p>
-        </w:tc>
-        <w:tc>
-          <w:tcPr>
-            <w:tcW w:type="dxa" w:w="2268"/>
-            <w:shd w:val="clear" w:color="auto" w:fill="F2F2F2"/>
-          </w:tcPr>
-          <w:p>
-            <w:r>
-              <w:rPr>
-                <w:sz w:val="18"/>
-              </w:rPr>
-              <w:t>1</w:t>
-            </w:r>
-          </w:p>
-        </w:tc>
-      </w:tr>
-      <w:tr>
-        <w:tc>
-          <w:tcPr>
-            <w:tcW w:type="dxa" w:w="5669"/>
-          </w:tcPr>
-          <w:p>
-            <w:r>
-              <w:rPr>
-                <w:sz w:val="18"/>
-              </w:rPr>
-              <w:t>virtualmachines</w:t>
-            </w:r>
-          </w:p>
-        </w:tc>
-        <w:tc>
-          <w:tcPr>
-            <w:tcW w:type="dxa" w:w="2268"/>
-          </w:tcPr>
-          <w:p>
-            <w:r>
-              <w:rPr>
-                <w:sz w:val="18"/>
-              </w:rPr>
-              <w:t>1</w:t>
-            </w:r>
-          </w:p>
-        </w:tc>
-      </w:tr>
-      <w:tr>
-        <w:tc>
-          <w:tcPr>
-            <w:tcW w:type="dxa" w:w="5669"/>
-            <w:shd w:val="clear" w:color="auto" w:fill="F2F2F2"/>
-          </w:tcPr>
-          <w:p>
-            <w:r>
-              <w:rPr>
-                <w:sz w:val="18"/>
-              </w:rPr>
-              <w:t>storageaccounts</w:t>
-            </w:r>
-          </w:p>
-        </w:tc>
-        <w:tc>
-          <w:tcPr>
-            <w:tcW w:type="dxa" w:w="2268"/>
-            <w:shd w:val="clear" w:color="auto" w:fill="F2F2F2"/>
-          </w:tcPr>
-          <w:p>
-            <w:r>
-              <w:rPr>
-                <w:sz w:val="18"/>
-              </w:rPr>
-              <w:t>1</w:t>
-            </w:r>
-          </w:p>
-        </w:tc>
-      </w:tr>
-      <w:tr>
-        <w:tc>
-          <w:tcPr>
-            <w:tcW w:type="dxa" w:w="5669"/>
-          </w:tcPr>
-          <w:p>
-            <w:r>
-              <w:rPr>
-                <w:sz w:val="18"/>
-              </w:rPr>
-              <w:t>extensions</w:t>
-            </w:r>
-          </w:p>
-        </w:tc>
-        <w:tc>
-          <w:tcPr>
-            <w:tcW w:type="dxa" w:w="2268"/>
-          </w:tcPr>
-          <w:p>
-            <w:r>
-              <w:rPr>
-                <w:sz w:val="18"/>
-              </w:rPr>
-              <w:t>1</w:t>
-            </w:r>
-          </w:p>
-        </w:tc>
-      </w:tr>
-      <w:tr>
-        <w:tc>
-          <w:tcPr>
-            <w:tcW w:type="dxa" w:w="5669"/>
-            <w:shd w:val="clear" w:color="auto" w:fill="F2F2F2"/>
-          </w:tcPr>
-          <w:p>
-            <w:r>
-              <w:rPr>
-                <w:sz w:val="18"/>
-              </w:rPr>
-              <w:t>publicipaddresses</w:t>
             </w:r>
           </w:p>
         </w:tc>
@@ -3601,8 +3601,55 @@
       </w:r>
     </w:p>
     <w:p>
+      <w:pPr>
+        <w:jc w:val="center"/>
+      </w:pPr>
       <w:r>
-        <w:t>[Estate diagram unavailable: failed to execute PosixPath('dot'), make sure the Graphviz executables are on your systems' PATH]</w:t>
+        <w:drawing>
+          <wp:inline xmlns:a="http://schemas.openxmlformats.org/drawingml/2006/main" xmlns:pic="http://schemas.openxmlformats.org/drawingml/2006/picture">
+            <wp:extent cx="5943600" cy="2240441"/>
+            <wp:docPr id="2" name="Picture 2"/>
+            <wp:cNvGraphicFramePr>
+              <a:graphicFrameLocks noChangeAspect="1"/>
+            </wp:cNvGraphicFramePr>
+            <a:graphic>
+              <a:graphicData uri="http://schemas.openxmlformats.org/drawingml/2006/picture">
+                <pic:pic>
+                  <pic:nvPicPr>
+                    <pic:cNvPr id="0" name="alz-estate-overview.png"/>
+                    <pic:cNvPicPr/>
+                  </pic:nvPicPr>
+                  <pic:blipFill>
+                    <a:blip r:embed="rId10"/>
+                    <a:stretch>
+                      <a:fillRect/>
+                    </a:stretch>
+                  </pic:blipFill>
+                  <pic:spPr>
+                    <a:xfrm>
+                      <a:off x="0" y="0"/>
+                      <a:ext cx="5943600" cy="2240441"/>
+                    </a:xfrm>
+                    <a:prstGeom prst="rect"/>
+                  </pic:spPr>
+                </pic:pic>
+              </a:graphicData>
+            </a:graphic>
+          </wp:inline>
+        </w:drawing>
+      </w:r>
+    </w:p>
+    <w:p>
+      <w:pPr>
+        <w:jc w:val="center"/>
+      </w:pPr>
+      <w:r>
+        <w:rPr>
+          <w:i/>
+          <w:color w:val="6B6B6B"/>
+          <w:sz w:val="18"/>
+        </w:rPr>
+        <w:t>Figure 2: Full Azure Landing Zone Estate</w:t>
       </w:r>
     </w:p>
     <w:p>

</xml_diff>